<commit_message>
Eliminar version con participantes y sincronizar metadatos y articulo tecnico sin participantes
</commit_message>
<xml_diff>
--- a/publicacion/manuscrito_difusiones/METADATOS_OJS_AUTORES.docx
+++ b/publicacion/manuscrito_difusiones/METADATOS_OJS_AUTORES.docx
@@ -148,7 +148,7 @@
           <w:rFonts w:ascii="Calibri" w:hAnsi="Calibri"/>
           <w:sz w:val="22"/>
         </w:rPr>
-        <w:t xml:space="preserve"> Integración de Agentes de Inteligencia Artificial y Protocolo MCP en la Evaluación Continua Universitaria: Arquitectura Técnica y Experiencia de Transferencia Docente</w:t>
+        <w:t xml:space="preserve"> Integración de Agentes de Inteligencia Artificial y Protocolo MCP en la Evaluación Continua Universitaria: Arquitectura Técnica, Gobernanza Contextual y Requisitos de Seguridad</w:t>
       </w:r>
     </w:p>
     <w:p>
@@ -175,7 +175,7 @@
           <w:rFonts w:ascii="Calibri" w:hAnsi="Calibri"/>
           <w:sz w:val="22"/>
         </w:rPr>
-        <w:t xml:space="preserve"> Integration of Artificial Intelligence Agents and the Model Context Protocol in Continuous University Assessment: Technical Architecture and a Faculty Professional Development Experience</w:t>
+        <w:t xml:space="preserve"> Integration of Artificial Intelligence Agents and the Model Context Protocol in Continuous University Assessment: Technical Architecture, Contextual Governance, and Security Requirements</w:t>
       </w:r>
     </w:p>
     <w:p>
@@ -209,7 +209,7 @@
           <w:i/>
           <w:sz w:val="21"/>
         </w:rPr>
-        <w:t>El avance acelerado de los Modelos de Lenguaje de Gran Escala (LLM) plantea desafíos sustanciales para las prácticas de evaluación en la enseñanza universitaria de la programación. Este artículo técnico presenta el diseño, implementación y evaluación exploratoria de una arquitectura sociotécnica basada en el Protocolo de Contexto de Modelo (</w:t>
+        <w:t>El avance acelerado de los Modelos de Lenguaje de Gran Escala (LLM) plantea desafíos sustanciales para las prácticas de evaluación en la enseñanza universitaria de la programación. Este artículo técnico presenta el diseño y la implementación de una arquitectura sociotécnica basada en el Protocolo de Contexto de Modelo (</w:t>
       </w:r>
       <w:r>
         <w:rPr>
@@ -225,7 +225,7 @@
           <w:i/>
           <w:sz w:val="21"/>
         </w:rPr>
-        <w:t>, MCP) y el principio de supervisión docente activa (</w:t>
+        <w:t>, MCP) y en el principio de supervisión docente activa (</w:t>
       </w:r>
       <w:r>
         <w:rPr>
@@ -241,7 +241,7 @@
           <w:i/>
           <w:sz w:val="21"/>
         </w:rPr>
-        <w:t>, HITL) para asistir la evaluación formativa continua, analizando las condiciones de transferibilidad técnica en una experiencia de capacitación docente. Metodológicamente, se adoptó un enfoque de Investigación Basada en el Diseño (DBR) estructurado en tres fases: diseño de artefactos de gobernanza contextual en texto plano (</w:t>
+        <w:t>, HITL) para asistir la evaluación formativa continua. La arquitectura se organiza en tres capas: gobernanza contextual mediante archivos de texto plano (</w:t>
       </w:r>
       <w:r>
         <w:rPr>
@@ -273,23 +273,7 @@
           <w:i/>
           <w:sz w:val="21"/>
         </w:rPr>
-        <w:t>, rúbricas analíticas y especificaciones formales de habilidades), pilotaje curricular en asignaturas universitarias de programación y ejecución de un taller intensivo de transferencia de diez horas reloj. La cohorte de validación estuvo constituida por 70 participantes sobre 80 personas inscriptas (tasa de asistencia del 87,5 %), integrada por docentes de ingeniería en informática y estudiantes avanzados y graduados de profesorado y licenciatura en informática educativa. La recolección de datos combinó telemetría del repositorio plantilla, registros de ejecución de integración continua en GitHub Actions y notas de campo estructuradas. Los resultados mostraron que 52 de los 70 asistentes (74,3 %) resolvieron el cuestionario web desacoplado; no obstante, únicamente 1 de los 70 participantes completó de forma autónoma el flujo de integración continua durante el horario sincrónico del taller. Este hallazgo evidencia una pronunciada brecha instrumental (</w:t>
-      </w:r>
-      <w:r>
-        <w:rPr>
-          <w:rFonts w:ascii="Calibri" w:hAnsi="Calibri"/>
-          <w:i/>
-          <w:sz w:val="21"/>
-        </w:rPr>
-        <w:t>tooling gap</w:t>
-      </w:r>
-      <w:r>
-        <w:rPr>
-          <w:rFonts w:ascii="Calibri" w:hAnsi="Calibri"/>
-          <w:i/>
-          <w:sz w:val="21"/>
-        </w:rPr>
-        <w:t>) vinculada a la fricción operativa del control de versiones por consola. La principal limitación radica en el carácter exploratorio del estudio y la ausencia de mediciones basales estandarizadas. Se concluye que la arquitectura proporciona bases operativas viables para encauzar la IA hacia una asistencia formativa supervisada, requiriendo interfaces visuales accesibles para su adopción generalizada.</w:t>
+        <w:t>, rúbricas analíticas y especificaciones formales de habilidades), interoperabilidad protocolizada con un servidor MCP de sistema de archivos restringido a rutas permitidas y privilegios mínimos, y supervisión docente de los borradores de prediagnóstico generados por el agente. Se describen, además, los instrumentos de transferencia desarrollados: un repositorio plantilla con evaluador automático en Python y flujo de integración continua en GitHub Actions sobre una escala de 100 puntos, y una colección de 35 aplicaciones web interactivas autocontenidas. El trabajo adopta un enfoque de Investigación Basada en el Diseño (DBR) y documenta un pilotaje curricular en dos asignaturas de programación y el diseño de un taller de transferencia de diez horas reloj, sin presentar datos ni observaciones de participantes como resultados de investigación. Se discuten los requisitos de seguridad conforme a las recomendaciones de OWASP y las implicancias de diseño derivadas de la literatura sobre carga cognitiva y dificultades instrumentales con el control de versiones. Las principales limitaciones son la ausencia de evaluación empírica con participantes, de medición de la calidad pedagógica de las devoluciones y de concordancia con evaluadores humanos. Se concluye que la arquitectura ofrece una base técnica viable y auditable para encauzar la IA hacia una asistencia formativa supervisada, cuya eficacia pedagógica deberá evaluarse en estudios posteriores con las garantías éticas correspondientes.</w:t>
       </w:r>
     </w:p>
     <w:p>
@@ -336,7 +320,7 @@
           <w:b/>
           <w:sz w:val="22"/>
         </w:rPr>
-        <w:t>Abstract (260 palabras):</w:t>
+        <w:t>Abstract (255 palabras):</w:t>
       </w:r>
     </w:p>
     <w:p>
@@ -350,7 +334,7 @@
           <w:i/>
           <w:sz w:val="21"/>
         </w:rPr>
-        <w:t>The rapid advancement of Large Language Models (LLMs) poses substantial challenges for traditional assessment practices in university computer science and programming education. This technical paper presents the design, implementation, and exploratory evaluation of a sociotechnical architecture based on the open standard Model Context Protocol (MCP) and the active Human-in-the-Loop (HITL) principle to assist continuous formative assessment, analyzing its technical transferability conditions within a teacher professional development context. Methodologically, the research adopted a Design-Based Research (DBR) framework structured across three sequential phases: the design of plain-text contextual governance artifacts (</w:t>
+        <w:t>The rapid advancement of Large Language Models (LLMs) poses substantial challenges for assessment practices in university programming education. This technical paper presents the design and implementation of a sociotechnical architecture based on the Model Context Protocol (MCP) and the active Human-in-the-Loop (HITL) principle to support continuous formative assessment. The architecture comprises three layers: contextual governance through plain-text files (</w:t>
       </w:r>
       <w:r>
         <w:rPr>
@@ -382,7 +366,7 @@
           <w:i/>
           <w:sz w:val="21"/>
         </w:rPr>
-        <w:t>, analytical rubrics, and formal teaching skill specifications), curricular piloting in university programming courses, and the delivery of an intensive ten-hour teacher training workshop. The validation cohort comprised 70 attendees out of 80 registered individuals (an 87.5% attendance rate), consisting of computer engineering faculty along with advanced pre-service teachers and recent graduates from educational informatics degree programs. Data collection combined template repository telemetry metrics, continuous integration execution logs on GitHub Actions, and structured qualitative field observation notes. Findings showed that 52 of the 70 attendees (74.3%) completed the decoupled web questionnaire; however, only 1 of the 70 participants autonomously completed the continuous integration pipeline during the synchronous workshop schedule. This outcome highlights a pronounced technical tooling gap associated with the operational friction of command-line version control tools. The main limitation lies in the exploratory nature of the study and the absence of standardized baseline measurements. We conclude that the architecture establishes viable operational foundations to guide AI toward supervised formative assistance, though accessible visual interfaces are essential for widespread faculty adoption.</w:t>
+        <w:t>, analytical rubrics, and formal skill specifications), protocolized interoperability through a file-system MCP server restricted to allowed paths and least privileges, and teacher supervision of the diagnostic drafts produced by the agent. The paper also describes the transfer instruments developed: a template repository with a Python autograder and a GitHub Actions continuous integration workflow on a 100-point scale, and a collection of 35 self-contained interactive web applications. Following a Design-Based Research (DBR) approach, it documents a curricular pilot in two programming courses and the design of a ten-hour transfer workshop, without presenting data or observations from participants as research results. Security requirements are discussed in line with OWASP recommendations, together with design implications drawn from the literature on cognitive load and the instrumental difficulties of version control systems. The main limitations are the absence of empirical evaluation with participants, of measures of the pedagogical quality of the feedback, and of agreement with human raters, so no claims are made about learning outcomes or adoption. We conclude that the architecture offers a viable and auditable technical basis for steering AI toward supervised formative assistance, whose pedagogical effectiveness must be assessed in subsequent studies with appropriate ethical safeguards.</w:t>
       </w:r>
     </w:p>
     <w:p>
@@ -1480,7 +1464,7 @@
         <w:t>Estimado Comité Editorial de la Revista DIFUSIONES:</w:t>
         <w:br/>
         <w:br/>
-        <w:t>Sometemos a su consideración el manuscrito en la categoría de Artículo Técnico titulado "Integración de Agentes de Inteligencia Artificial y Protocolo MCP en la Evaluación Continua Universitaria: Arquitectura Técnica y Experiencia de Transferencia Docente".</w:t>
+        <w:t>Sometemos a su consideración el manuscrito en la categoría de Artículo Técnico titulado "Integración de Agentes de Inteligencia Artificial y Protocolo MCP en la Evaluación Continua Universitaria: Arquitectura Técnica, Gobernanza Contextual y Requisitos de Seguridad".</w:t>
         <w:br/>
         <w:br/>
         <w:t>Declaramos formalmente que:</w:t>
@@ -1489,132 +1473,25 @@
         <w:t>1. El trabajo es una contribución técnica original e inédita y no se encuentra postulado simultáneamente en otra publicación periódica.</w:t>
         <w:br/>
         <w:br/>
-        <w:t>2. Los autores declaran no tener conflictos de interés en relación con este trabajo.</w:t>
+        <w:t>2. Los autores declaran no tener conflictos de interés institucionales, profesionales, financieros ni personales en relación con este trabajo.</w:t>
         <w:br/>
         <w:br/>
         <w:t>3. El manuscrito remitido ha sido anonimizado exhaustivamente (tanto en su cuerpo de texto como en las propiedades del archivo Word) para dar estricto cumplimiento a la evaluación a doble ciego.</w:t>
         <w:br/>
         <w:br/>
-        <w:t>4. La fuente de financiamiento y apoyo institucional corresponde al proyecto acreditado en la Convocatoria DASS-UCSE 2025 adjudicado mediante Disposición N.º 691-2025 del Consejo del DASS, cuyos datos identificatorios han sido omitidos del manuscrito principal y registrados en los campos de metadatos de esta plataforma para ser incorporados tras la aceptación.</w:t>
+        <w:t>4. La fuente de financiamiento y apoyo institucional corresponde al proyecto acreditado en la Convocatoria DASS-UCSE 2025 adjudicado mediante Disposición N.º 691-2025 del Consejo del DASS (Anexo 1, Orden de Mérito N.º 08, con período de ejecución del 22 de diciembre de 2025 al 22 de diciembre de 2026), cuyos datos identificatorios han sido omitidos del manuscrito principal para preservar la evaluación a doble ciego y registrados en los campos de metadatos de esta plataforma para ser incorporados tras la aceptación.</w:t>
         <w:br/>
         <w:br/>
-        <w:t>5. En relación con las consideraciones éticas, el estudio involucró participantes humanos (n = 70) en un taller formativo voluntario; los registros analizados proceden de telemetría de repositorios, códigos alfanuméricos temporales y notas cualitativas de incidencias, tratados de forma agregada y sin datos personales sensibles. Se informó oralmente a los asistentes sobre el propósito de la actividad y su carácter voluntario, sin formularios individuales de consentimiento. Se declara abiertamente que la actividad no contó con evaluación previa ni con certificación formal de exención por un comité de ética institucional, circunstancia asumida como limitación ética y procedimental del diseño. [COMPLETAR ANTES DEL ENVÍO con la determinación escrita de la autoridad institucional, si ya fue emitida (ver bloque condicional más abajo).]</w:t>
+        <w:t>5. En relación con el alcance del trabajo y las consideraciones éticas, el manuscrito describe el diseño y la implementación de una arquitectura sociotécnica y sus instrumentos de transferencia. No presenta como resultados de investigación datos, métricas de progresión, verbalizaciones, notas de campo ni observaciones correspondientes a participantes humanos. La experiencia formativa se menciona exclusivamente como contexto de diseño de los recursos. Los estudios empíricos posteriores serán sometidos a evaluación ética previa y requerirán consentimiento informado, libre y previo.</w:t>
         <w:br/>
         <w:br/>
-        <w:t>6. Se declara el uso de herramientas de inteligencia artificial (Antigravity IDE con modelos Claude 3.7 Sonnet y Gemini, y Microsoft Copilot) exclusivamente para asistencia preliminar de organización, estilo, traducción del abstract y cotejo de directrices editoriales, sin haber sido utilizadas para la generación de datos empíricos ni referencias bibliográficas.</w:t>
+        <w:t>6. Se declara el uso de herramientas de inteligencia artificial (Antigravity IDE con modelos Claude 3.7 Sonnet y Gemini, y Microsoft Copilot) bajo el título "Declaración sobre uso de IA", exclusivamente para asistencia preliminar de organización, estilo, traducción del abstract y cotejo de directrices editoriales, sin haber sido utilizadas para la generación de datos empíricos ni referencias bibliográficas.</w:t>
         <w:br/>
         <w:br/>
         <w:t>7. Se adjunta de forma separada la Figura 1 en formato PNG de alta resolución (300 DPI reales, ancho 15.24 cm).</w:t>
         <w:br/>
         <w:br/>
         <w:t>Agradecemos su atención y quedamos a su entera disposición.</w:t>
-      </w:r>
-    </w:p>
-    <w:p>
-      <w:pPr>
-        <w:spacing w:before="280" w:after="80"/>
-      </w:pPr>
-      <w:r>
-        <w:rPr>
-          <w:b/>
-          <w:color w:val="1F6EA5"/>
-          <w:sz w:val="26"/>
-        </w:rPr>
-        <w:t>REDACCIÓN CONDICIONAL SEGÚN LA RESPUESTA INSTITUCIONAL (usar solo si el documento existe)</w:t>
-      </w:r>
-    </w:p>
-    <w:p>
-      <w:pPr>
-        <w:spacing w:before="80" w:after="120"/>
-        <w:ind w:left="454"/>
-      </w:pPr>
-      <w:r>
-        <w:rPr>
-          <w:b/>
-          <w:color w:val="B4321E"/>
-        </w:rPr>
-        <w:t xml:space="preserve">ATENCIÓN: </w:t>
-      </w:r>
-    </w:p>
-    <w:p>
-      <w:pPr>
-        <w:spacing w:before="80" w:after="120"/>
-        <w:ind w:left="454"/>
-      </w:pPr>
-      <w:r>
-        <w:rPr>
-          <w:rFonts w:ascii="Calibri" w:hAnsi="Calibri"/>
-          <w:i/>
-          <w:sz w:val="21"/>
-        </w:rPr>
-        <w:t>No enviar el manuscrito afirmando exención ni encuadre favorable sin una determinación escrita de la autoridad o comité competente. Una constancia posterior no equivale a una aprobación ética previa ni es retroactiva.</w:t>
-      </w:r>
-    </w:p>
-    <w:p>
-      <w:pPr>
-        <w:spacing w:after="80"/>
-      </w:pPr>
-      <w:r>
-        <w:rPr>
-          <w:rFonts w:ascii="Calibri" w:hAnsi="Calibri"/>
-          <w:b/>
-          <w:sz w:val="22"/>
-        </w:rPr>
-        <w:t>Si la autoridad determinó que no requería evaluación formal:</w:t>
-      </w:r>
-    </w:p>
-    <w:p>
-      <w:pPr>
-        <w:spacing w:before="120" w:after="160"/>
-        <w:ind w:left="454" w:right="454"/>
-      </w:pPr>
-      <w:r>
-        <w:rPr>
-          <w:rFonts w:ascii="Calibri" w:hAnsi="Calibri"/>
-          <w:color w:val="282828"/>
-          <w:sz w:val="20"/>
-        </w:rPr>
-        <w:t>La autoridad institucional competente determinó que la actividad, por su carácter formativo, voluntario y por utilizar exclusivamente registros técnicos agregados sin conservación de identificadores personales, no requería revisión previa por un comité de ética. El correspondiente dictamen de encuadre institucional fue emitido mediante [identificación del documento y fecha].</w:t>
-      </w:r>
-    </w:p>
-    <w:p>
-      <w:pPr>
-        <w:spacing w:after="80"/>
-      </w:pPr>
-      <w:r>
-        <w:rPr>
-          <w:rFonts w:ascii="Calibri" w:hAnsi="Calibri"/>
-          <w:b/>
-          <w:sz w:val="22"/>
-        </w:rPr>
-        <w:t>Si determinó que correspondía otro procedimiento, o admitió la difusión bajo condiciones:</w:t>
-      </w:r>
-      <w:r>
-        <w:rPr>
-          <w:rFonts w:ascii="Calibri" w:hAnsi="Calibri"/>
-          <w:sz w:val="22"/>
-        </w:rPr>
-        <w:t xml:space="preserve"> transcribir fielmente la determinación y las condiciones, con identificación del documento y fecha.</w:t>
-      </w:r>
-    </w:p>
-    <w:p>
-      <w:pPr>
-        <w:spacing w:after="80"/>
-      </w:pPr>
-      <w:r>
-        <w:rPr>
-          <w:rFonts w:ascii="Calibri" w:hAnsi="Calibri"/>
-          <w:b/>
-          <w:sz w:val="22"/>
-        </w:rPr>
-        <w:t>Si determinó que los resultados con participantes humanos no deben publicarse en su forma actual:</w:t>
-      </w:r>
-      <w:r>
-        <w:rPr>
-          <w:rFonts w:ascii="Calibri" w:hAnsi="Calibri"/>
-          <w:sz w:val="22"/>
-        </w:rPr>
-        <w:t xml:space="preserve"> no enviar; consultar al Comité Editorial sobre reducir el manuscrito a la arquitectura y la evidencia no humana.</w:t>
       </w:r>
     </w:p>
     <w:p>
@@ -1725,7 +1602,7 @@
           <w:rFonts w:ascii="Calibri" w:hAnsi="Calibri"/>
           <w:sz w:val="22"/>
         </w:rPr>
-        <w:t xml:space="preserve"> Cumplen estrictamente con el rango reglamentario de 250 a 300 palabras (Resumen: 296 palabras; Abstract: 260 palabras).</w:t>
+        <w:t xml:space="preserve"> Cumplen estrictamente con el rango reglamentario de 250 a 300 palabras (Resumen: 296 palabras; Abstract: 255 palabras).</w:t>
       </w:r>
     </w:p>
     <w:p>
@@ -1880,7 +1757,7 @@
           <w:rFonts w:ascii="Calibri" w:hAnsi="Calibri"/>
           <w:sz w:val="22"/>
         </w:rPr>
-        <w:t xml:space="preserve"> Incorporada en el manuscrito identificando herramientas (Antigravity IDE, Claude, Gemini, Copilot) y propósitos, con salvaguarda explícita de no generación de datos ni referencias y asunción plena de autoría humana.</w:t>
+        <w:t xml:space="preserve"> Incorporada en el manuscrito bajo la denominación editorial exacta "Declaración sobre uso de IA", identificando herramientas (Antigravity IDE, Claude, Gemini, Copilot) y propósitos, con salvaguarda explícita de no generación de datos ni referencias y asunción plena de autoría humana.</w:t>
       </w:r>
     </w:p>
     <w:p>
@@ -1908,7 +1785,7 @@
           <w:rFonts w:ascii="Calibri" w:hAnsi="Calibri"/>
           <w:sz w:val="22"/>
         </w:rPr>
-        <w:t xml:space="preserve"> Incluyen declaración explícita de conflictos de interés, financiamiento institucional, encuadre de validación técnica, uso asistido de IA y archivos adjuntos.</w:t>
+        <w:t xml:space="preserve"> Incluyen declaración explícita de originalidad, conflictos de interés, financiamiento institucional completo, alcance técnico sin datos de participantes, uso asistido de IA y archivos adjuntos.</w:t>
       </w:r>
     </w:p>
     <w:sectPr>

</xml_diff>

<commit_message>
Refinar precision etica y metodologica, eliminar fuente Consolas (100% Times New Roman) y ajustar checklist
</commit_message>
<xml_diff>
--- a/publicacion/manuscrito_difusiones/METADATOS_OJS_AUTORES.docx
+++ b/publicacion/manuscrito_difusiones/METADATOS_OJS_AUTORES.docx
@@ -1630,35 +1630,7 @@
           <w:rFonts w:ascii="Calibri" w:hAnsi="Calibri"/>
           <w:sz w:val="22"/>
         </w:rPr>
-        <w:t xml:space="preserve"> Formato nativo de Word según APA 7ª (sin líneas verticales, notas a 10 pt indicando elaboración propia y fuente), con fila 1 marcada estructuralmente como encabezado repetible (</w:t>
-      </w:r>
-      <w:r>
-        <w:rPr>
-          <w:rFonts w:ascii="Consolas" w:hAnsi="Consolas"/>
-          <w:sz w:val="20"/>
-        </w:rPr>
-        <w:t>tblHeader</w:t>
-      </w:r>
-      <w:r>
-        <w:rPr>
-          <w:rFonts w:ascii="Calibri" w:hAnsi="Calibri"/>
-          <w:sz w:val="22"/>
-        </w:rPr>
-        <w:t>) y prevención de corte (</w:t>
-      </w:r>
-      <w:r>
-        <w:rPr>
-          <w:rFonts w:ascii="Consolas" w:hAnsi="Consolas"/>
-          <w:sz w:val="20"/>
-        </w:rPr>
-        <w:t>cantSplit</w:t>
-      </w:r>
-      <w:r>
-        <w:rPr>
-          <w:rFonts w:ascii="Calibri" w:hAnsi="Calibri"/>
-          <w:sz w:val="22"/>
-        </w:rPr>
-        <w:t>).</w:t>
+        <w:t xml:space="preserve"> No se incluyen tablas en la versión actual del manuscrito (0 tablas, 1 figura).</w:t>
       </w:r>
     </w:p>
     <w:p>

</xml_diff>

<commit_message>
Armonizar instrumentos en 2.3, viabilidad exploratoria en 3.1, temporalidad del taller y precisiones menores
</commit_message>
<xml_diff>
--- a/publicacion/manuscrito_difusiones/METADATOS_OJS_AUTORES.docx
+++ b/publicacion/manuscrito_difusiones/METADATOS_OJS_AUTORES.docx
@@ -195,7 +195,7 @@
           <w:b/>
           <w:sz w:val="22"/>
         </w:rPr>
-        <w:t>Resumen (296 palabras):</w:t>
+        <w:t>Resumen (298 palabras):</w:t>
       </w:r>
     </w:p>
     <w:p>
@@ -273,7 +273,7 @@
           <w:i/>
           <w:sz w:val="21"/>
         </w:rPr>
-        <w:t>, rúbricas analíticas y especificaciones formales de habilidades), interoperabilidad protocolizada con un servidor MCP de sistema de archivos restringido a rutas permitidas y privilegios mínimos, y supervisión docente de los borradores de prediagnóstico generados por el agente. Se describen, además, los instrumentos de transferencia desarrollados: un repositorio plantilla con evaluador automático en Python y flujo de integración continua en GitHub Actions sobre una escala de 100 puntos, y una colección de 35 aplicaciones web interactivas autocontenidas. El trabajo adopta un enfoque de Investigación Basada en el Diseño (DBR) y documenta un pilotaje curricular en dos asignaturas de programación y el diseño de un taller de transferencia de diez horas reloj, sin presentar datos ni observaciones de participantes como resultados de investigación. Se discuten los requisitos de seguridad conforme a las recomendaciones de OWASP y las implicancias de diseño derivadas de la literatura sobre carga cognitiva y dificultades instrumentales con el control de versiones. Las principales limitaciones son la ausencia de evaluación empírica con participantes, de medición de la calidad pedagógica de las devoluciones y de concordancia con evaluadores humanos. Se concluye que la arquitectura ofrece una base técnica viable y auditable para encauzar la IA hacia una asistencia formativa supervisada, cuya eficacia pedagógica deberá evaluarse en estudios posteriores con las garantías éticas correspondientes.</w:t>
+        <w:t>, rúbricas analíticas y especificaciones formales de habilidades), interoperabilidad protocolizada con un servidor MCP de sistema de archivos restringido a rutas permitidas y privilegios mínimos, y supervisión docente de los borradores de prediagnóstico generados por el agente. Se describen, además, los instrumentos de transferencia desarrollados: un repositorio plantilla con evaluador automático en Python y flujo de integración continua en GitHub Actions sobre una escala de 100 puntos, y una colección de 35 aplicaciones web interactivas autocontenidas. El trabajo adopta un enfoque de Investigación Basada en el Diseño (DBR) y documenta un pilotaje curricular en dos asignaturas de programación y el diseño y dictado de un taller de transferencia de diez horas reloj, sin presentar datos ni observaciones de participantes como resultados de investigación. Se discuten los requisitos de seguridad conforme a las recomendaciones de OWASP y las implicancias de diseño derivadas de la literatura sobre carga cognitiva y dificultades instrumentales con el control de versiones. Las principales limitaciones son la ausencia de evaluación empírica con participantes, de medición de la calidad pedagógica de las devoluciones y de concordancia con evaluadores humanos. Se concluye que la arquitectura ofrece una base técnica viable y auditable para encauzar la IA hacia una asistencia formativa supervisada, cuya eficacia pedagógica deberá evaluarse en estudios posteriores con las garantías éticas correspondientes.</w:t>
       </w:r>
     </w:p>
     <w:p>
@@ -320,7 +320,7 @@
           <w:b/>
           <w:sz w:val="22"/>
         </w:rPr>
-        <w:t>Abstract (255 palabras):</w:t>
+        <w:t>Abstract (257 palabras):</w:t>
       </w:r>
     </w:p>
     <w:p>
@@ -366,7 +366,7 @@
           <w:i/>
           <w:sz w:val="21"/>
         </w:rPr>
-        <w:t>, analytical rubrics, and formal skill specifications), protocolized interoperability through a file-system MCP server restricted to allowed paths and least privileges, and teacher supervision of the diagnostic drafts produced by the agent. The paper also describes the transfer instruments developed: a template repository with a Python autograder and a GitHub Actions continuous integration workflow on a 100-point scale, and a collection of 35 self-contained interactive web applications. Following a Design-Based Research (DBR) approach, it documents a curricular pilot in two programming courses and the design of a ten-hour transfer workshop, without presenting data or observations from participants as research results. Security requirements are discussed in line with OWASP recommendations, together with design implications drawn from the literature on cognitive load and the instrumental difficulties of version control systems. The main limitations are the absence of empirical evaluation with participants, of measures of the pedagogical quality of the feedback, and of agreement with human raters, so no claims are made about learning outcomes or adoption. We conclude that the architecture offers a viable and auditable technical basis for steering AI toward supervised formative assistance, whose pedagogical effectiveness must be assessed in subsequent studies with appropriate ethical safeguards.</w:t>
+        <w:t>, analytical rubrics, and formal skill specifications), protocolized interoperability through a file-system MCP server restricted to allowed paths and least privileges, and teacher supervision of the diagnostic drafts produced by the agent. The paper also describes the transfer instruments developed: a template repository with a Python autograder and a GitHub Actions continuous integration workflow on a 100-point scale, and a collection of 35 self-contained interactive web applications. Following a Design-Based Research (DBR) approach, it documents a curricular pilot in two programming courses and the design and delivery of a ten-hour transfer workshop, without presenting data or observations from participants as research results. Security requirements are discussed in line with OWASP recommendations, together with design implications drawn from the literature on cognitive load and the instrumental difficulties of version control systems. The main limitations are the absence of empirical evaluation with participants, of measures of the pedagogical quality of the feedback, and of agreement with human raters, so no claims are made about learning outcomes or adoption. We conclude that the architecture offers a viable and auditable technical basis for steering AI toward supervised formative assistance, whose pedagogical effectiveness must be assessed in subsequent studies with appropriate ethical safeguards.</w:t>
       </w:r>
     </w:p>
     <w:p>
@@ -1485,7 +1485,7 @@
         <w:t>5. En relación con el alcance del trabajo y las consideraciones éticas, el manuscrito describe el diseño y la implementación de una arquitectura sociotécnica y sus instrumentos de transferencia. No presenta como resultados de investigación datos, métricas de progresión, verbalizaciones, notas de campo ni observaciones correspondientes a participantes humanos. La experiencia formativa se menciona exclusivamente como contexto de diseño de los recursos. Los estudios empíricos posteriores serán sometidos a evaluación ética previa y requerirán consentimiento informado, libre y previo.</w:t>
         <w:br/>
         <w:br/>
-        <w:t>6. Se declara el uso de herramientas de inteligencia artificial (Antigravity IDE con modelos Claude 3.7 Sonnet y Gemini, y Microsoft Copilot) bajo el título "Declaración sobre uso de IA", exclusivamente para asistencia preliminar de organización, estilo, traducción del abstract y cotejo de directrices editoriales, sin haber sido utilizadas para la generación de datos empíricos ni referencias bibliográficas.</w:t>
+        <w:t>6. Se declara el uso de herramientas de inteligencia artificial (Antigravity IDE con modelos Claude 3.7 Sonnet y Gemini 2.5 Pro, y Microsoft Copilot) bajo el título "Declaración sobre uso de IA", exclusivamente para asistencia preliminar de organización, estilo, traducción del abstract y cotejo de directrices editoriales, sin haber sido utilizadas para la generación de datos empíricos ni referencias bibliográficas.</w:t>
         <w:br/>
         <w:br/>
         <w:t>7. Se adjunta de forma separada la Figura 1 en formato PNG de alta resolución (300 DPI reales, ancho 15.24 cm).</w:t>
@@ -1602,7 +1602,7 @@
           <w:rFonts w:ascii="Calibri" w:hAnsi="Calibri"/>
           <w:sz w:val="22"/>
         </w:rPr>
-        <w:t xml:space="preserve"> Cumplen estrictamente con el rango reglamentario de 250 a 300 palabras (Resumen: 296 palabras; Abstract: 255 palabras).</w:t>
+        <w:t xml:space="preserve"> Cumplen estrictamente con el rango reglamentario de 250 a 300 palabras (Resumen: 298 palabras; Abstract: 257 palabras).</w:t>
       </w:r>
     </w:p>
     <w:p>

</xml_diff>

<commit_message>
Actualizar biografias academicas de Fabio Arganaraz y Gabriela Bejarano en metadatos OJS
</commit_message>
<xml_diff>
--- a/publicacion/manuscrito_difusiones/METADATOS_OJS_AUTORES.docx
+++ b/publicacion/manuscrito_difusiones/METADATOS_OJS_AUTORES.docx
@@ -613,7 +613,7 @@
           <w:rFonts w:ascii="Calibri" w:hAnsi="Calibri"/>
           <w:sz w:val="22"/>
         </w:rPr>
-        <w:t>Ingeniero en Informática y docente universitario en la Universidad Católica de Santiago del Estero (UCSE - DASS), desempeñándose como profesor en asignaturas de programación y desarrollo de software. Es Director del proyecto de investigación "Agentes de IA y Protocolo MCP para evaluación continua y autoevaluación en materias de Ingeniería en Informática" (Convocatoria DASS UCSE 2025). Sus líneas de interés incluyen la inteligencia artificial aplicada a la educación, la arquitectura de software y la integración continua en entornos formativos.</w:t>
+        <w:t>Ingeniero en Informática graduado con Medalla al Mejor Promedio por la Universidad Nacional de Jujuy (UNJu). Cuenta con más de ocho años de trayectoria en docencia universitaria de grado en ciencias de la computación, desempeñándose actualmente como profesor en asignaturas de programación y desarrollo de software en la Universidad Católica de Santiago del Estero (UCSE - DASS). Es Director del proyecto de investigación "Agentes de IA y Protocolo MCP para evaluación continua y autoevaluación en materias de Ingeniería en Informática" (Convocatoria DASS-UCSE 2025). Se especializa en tecnología educativa (EdTech), diseño de arquitecturas sociotécnicas, integración de agentes de inteligencia artificial en la didáctica de la programación y automatización de la evaluación continua.</w:t>
       </w:r>
     </w:p>
     <w:p>
@@ -801,7 +801,7 @@
           <w:rFonts w:ascii="Calibri" w:hAnsi="Calibri"/>
           <w:sz w:val="22"/>
         </w:rPr>
-        <w:t>Ingeniera y docente investigadora universitaria en el Departamento Académico San Salvador de la Universidad Católica de Santiago del Estero (UCSE). Se desempeña como Asesora Metodológica en proyectos de investigación científica y tecnológica orientados a la innovación pedagógica en ingeniería y ciencias de la computación.</w:t>
+        <w:t>Especialista en gestión de proyectos ágiles, ingeniería de software y ciencia de datos. Cuenta con la prestigiosa acreditación de Educadora Internacional de Ingeniería (ING.PAED.IGIP) otorgada por la IGIP, y la certificación "Scrum Master Professional Certificate" (CertiProf), respaldando su amplia experiencia en la facilitación de equipos de desarrollo. Actualmente cursa la Maestría en Ciencia de Datos en la UCASAL. Combina su práctica profesional en la gestión pública con un fuerte perfil académico, siendo miembro activo del Gabinete de Investigación en Informática y Tecnología de la UCSE-DASS. Su enfoque garantiza la calidad metodológica, el rigor analítico y la correcta implementación de procesos en el desarrollo de software.</w:t>
       </w:r>
     </w:p>
     <w:p>

</xml_diff>